<commit_message>
compeleted lower bound and upper bound
</commit_message>
<xml_diff>
--- a/Theory/Theory.docx
+++ b/Theory/Theory.docx
@@ -15,6 +15,7 @@
         <w:rPr>
           <w:b/>
           <w:bCs/>
+          <w:noProof/>
           <w:sz w:val="32"/>
           <w:szCs w:val="32"/>
         </w:rPr>
@@ -116,6 +117,7 @@
         <w:rPr>
           <w:b/>
           <w:bCs/>
+          <w:noProof/>
           <w:sz w:val="32"/>
           <w:szCs w:val="32"/>
         </w:rPr>
@@ -193,6 +195,9 @@
     </w:p>
     <w:p>
       <w:r>
+        <w:rPr>
+          <w:noProof/>
+        </w:rPr>
         <w:drawing>
           <wp:inline distT="0" distB="0" distL="0" distR="0" wp14:anchorId="49C952FD" wp14:editId="22897A4B">
             <wp:extent cx="5943600" cy="2205990"/>
@@ -307,6 +312,9 @@
     </w:p>
     <w:p>
       <w:r>
+        <w:rPr>
+          <w:noProof/>
+        </w:rPr>
         <w:drawing>
           <wp:inline distT="0" distB="0" distL="0" distR="0" wp14:anchorId="103D9954" wp14:editId="0F4D3D4D">
             <wp:extent cx="5943600" cy="2579370"/>
@@ -380,6 +388,9 @@
     </w:p>
     <w:p>
       <w:r>
+        <w:rPr>
+          <w:noProof/>
+        </w:rPr>
         <w:drawing>
           <wp:inline distT="0" distB="0" distL="0" distR="0" wp14:anchorId="09B19DB4" wp14:editId="7BA0A13F">
             <wp:extent cx="5943600" cy="1767205"/>
@@ -449,6 +460,9 @@
     </w:p>
     <w:p>
       <w:r>
+        <w:rPr>
+          <w:noProof/>
+        </w:rPr>
         <w:drawing>
           <wp:inline distT="0" distB="0" distL="0" distR="0" wp14:anchorId="03E3A256" wp14:editId="23E9CA99">
             <wp:extent cx="5943600" cy="2977515"/>
@@ -562,12 +576,21 @@
           <w:numId w:val="4"/>
         </w:numPr>
       </w:pPr>
-      <w:r>
-        <w:rPr>
-          <w:b/>
-          <w:bCs/>
-        </w:rPr>
-        <w:t xml:space="preserve">isEmpty() </w:t>
+      <w:proofErr w:type="spellStart"/>
+      <w:r>
+        <w:rPr>
+          <w:b/>
+          <w:bCs/>
+        </w:rPr>
+        <w:t>isEmpty</w:t>
+      </w:r>
+      <w:proofErr w:type="spellEnd"/>
+      <w:r>
+        <w:rPr>
+          <w:b/>
+          <w:bCs/>
+        </w:rPr>
+        <w:t xml:space="preserve">() </w:t>
       </w:r>
       <w:r>
         <w:t>- Checks if the queue is empty.</w:t>
@@ -629,6 +652,197 @@
     </w:p>
     <w:p/>
     <w:p/>
+    <w:p>
+      <w:r>
+        <w:br w:type="page"/>
+      </w:r>
+    </w:p>
+    <w:p>
+      <w:hyperlink r:id="rId11" w:history="1">
+        <w:r>
+          <w:rPr>
+            <w:rStyle w:val="Hyperlink"/>
+          </w:rPr>
+          <w:br/>
+          <w:t>Track</w:t>
+        </w:r>
+      </w:hyperlink>
+    </w:p>
+    <w:p>
+      <w:pPr>
+        <w:rPr>
+          <w:b/>
+          <w:bCs/>
+        </w:rPr>
+      </w:pPr>
+      <w:r>
+        <w:rPr>
+          <w:b/>
+          <w:bCs/>
+        </w:rPr>
+        <w:t>Command Palette</w:t>
+      </w:r>
+    </w:p>
+    <w:p>
+      <w:r>
+        <w:t>Search for a command to run...</w:t>
+      </w:r>
+    </w:p>
+    <w:p>
+      <w:proofErr w:type="spellStart"/>
+      <w:r>
+        <w:t>BlogDiscussion</w:t>
+      </w:r>
+      <w:proofErr w:type="spellEnd"/>
+    </w:p>
+    <w:p>
+      <w:pPr>
+        <w:rPr>
+          <w:b/>
+          <w:bCs/>
+        </w:rPr>
+      </w:pPr>
+      <w:r>
+        <w:rPr>
+          <w:b/>
+          <w:bCs/>
+        </w:rPr>
+        <w:t>Implement Lower Bound</w:t>
+      </w:r>
+    </w:p>
+    <w:p>
+      <w:r>
+        <w:t>23</w:t>
+      </w:r>
+    </w:p>
+    <w:p>
+      <w:r>
+        <w:rPr>
+          <w:b/>
+          <w:bCs/>
+        </w:rPr>
+        <w:t>Problem Statement: </w:t>
+      </w:r>
+      <w:r>
+        <w:t>Given a sorted array of N integers and an integer x, write a program to find the lower bound of x.</w:t>
+      </w:r>
+    </w:p>
+    <w:p>
+      <w:pPr>
+        <w:rPr>
+          <w:b/>
+          <w:bCs/>
+        </w:rPr>
+      </w:pPr>
+    </w:p>
+    <w:p>
+      <w:pPr>
+        <w:rPr>
+          <w:b/>
+          <w:bCs/>
+        </w:rPr>
+      </w:pPr>
+    </w:p>
+    <w:p>
+      <w:pPr>
+        <w:rPr>
+          <w:b/>
+          <w:bCs/>
+        </w:rPr>
+      </w:pPr>
+      <w:r>
+        <w:rPr>
+          <w:b/>
+          <w:bCs/>
+        </w:rPr>
+        <w:t>What is lower bound?</w:t>
+      </w:r>
+    </w:p>
+    <w:p>
+      <w:r>
+        <w:t>The lower bound algorithm finds the first or the smallest index in a sorted array where the value at that index is greater than or equal to a given key i.e. x.</w:t>
+      </w:r>
+    </w:p>
+    <w:p>
+      <w:r>
+        <w:t xml:space="preserve">The lower bound is the smallest index, </w:t>
+      </w:r>
+      <w:proofErr w:type="spellStart"/>
+      <w:r>
+        <w:t>ind</w:t>
+      </w:r>
+      <w:proofErr w:type="spellEnd"/>
+      <w:r>
+        <w:t xml:space="preserve">, where </w:t>
+      </w:r>
+      <w:proofErr w:type="spellStart"/>
+      <w:r>
+        <w:t>arr</w:t>
+      </w:r>
+      <w:proofErr w:type="spellEnd"/>
+      <w:r>
+        <w:t>[</w:t>
+      </w:r>
+      <w:proofErr w:type="spellStart"/>
+      <w:r>
+        <w:t>ind</w:t>
+      </w:r>
+      <w:proofErr w:type="spellEnd"/>
+      <w:r>
+        <w:t>] &gt;= x. But if any such index is not found, the lower bound algorithm returns n i.e. size of the given array.</w:t>
+      </w:r>
+    </w:p>
+    <w:p/>
+    <w:p/>
+    <w:p>
+      <w:pPr>
+        <w:rPr>
+          <w:b/>
+          <w:bCs/>
+        </w:rPr>
+      </w:pPr>
+      <w:r>
+        <w:rPr>
+          <w:b/>
+          <w:bCs/>
+        </w:rPr>
+        <w:t>What is Upper Bound?</w:t>
+      </w:r>
+    </w:p>
+    <w:p>
+      <w:r>
+        <w:t>The upper bound algorithm finds the first or the smallest index in a sorted array where the value at that index is greater than the given key i.e. x.</w:t>
+      </w:r>
+    </w:p>
+    <w:p>
+      <w:r>
+        <w:t xml:space="preserve">The upper bound is the smallest index, </w:t>
+      </w:r>
+      <w:proofErr w:type="spellStart"/>
+      <w:r>
+        <w:t>ind</w:t>
+      </w:r>
+      <w:proofErr w:type="spellEnd"/>
+      <w:r>
+        <w:t xml:space="preserve">, where </w:t>
+      </w:r>
+      <w:proofErr w:type="spellStart"/>
+      <w:r>
+        <w:t>arr</w:t>
+      </w:r>
+      <w:proofErr w:type="spellEnd"/>
+      <w:r>
+        <w:t>[</w:t>
+      </w:r>
+      <w:proofErr w:type="spellStart"/>
+      <w:r>
+        <w:t>ind</w:t>
+      </w:r>
+      <w:proofErr w:type="spellEnd"/>
+      <w:r>
+        <w:t>] &gt; x.</w:t>
+      </w:r>
+    </w:p>
     <w:p/>
     <w:sectPr>
       <w:pgSz w:w="12240" w:h="15840"/>

</xml_diff>